<commit_message>
Brief 05: 100 fêmeas em 45 dias na descrição da Ideia 1, na promessa e na lead A
Co-Authored-By: Claude Fable 5.1 <noreply@anthropic.com>
Claude-Session: https://claude.ai/code/session_017HYp1xhSzB6Ui5hyJvLbGE
</commit_message>
<xml_diff>
--- a/05_Brief_de_Oferta_VSL2_Duas_Opcoes.docx
+++ b/05_Brief_de_Oferta_VSL2_Duas_Opcoes.docx
@@ -552,7 +552,7 @@
         <w:t xml:space="preserve">“</w:t>
       </w:r>
       <w:r>
-        <w:t xml:space="preserve">A mesma erva do frasco de $14 que você já comprou; só que a flor, não o talo, e do jeito que o bode come.</w:t>
+        <w:t xml:space="preserve">A mesma erva do frasco de $14 que você já comprou; só que a flor, não o talo, e do jeito que o bode que cobre 100 fêmeas come.</w:t>
       </w:r>
       <w:r>
         <w:t xml:space="preserve">”</w:t>
@@ -1276,16 +1276,44 @@
         <w:t xml:space="preserve"> </w:t>
       </w:r>
       <w:r>
-        <w:t xml:space="preserve">No Hill Country, o bode reprodutor de 12 anos (um homem de 80) entra no curral e as fêmeas entram no cio só de sentir o cheiro dele. Ele come o mesmo capim com o mesmo veneno que está no seu bife, e não cimenta. O criador tem um balde escrito SODA ao lado do cocho (verdade checável: tampão de rúmen) e um pote de mel escuro na prateleira do curral. Na época da monta, uma colher daquele mel, uma pitada daquele pó, água morna, no cocho. Pergunta paradoxal:</w:t>
-      </w:r>
-      <w:r>
-        <w:t xml:space="preserve"> </w:t>
-      </w:r>
-      <w:r>
-        <w:t xml:space="preserve">“</w:t>
-      </w:r>
-      <w:r>
-        <w:t xml:space="preserve">Se a erva do bode está em todo Walmart por $14, por que você continua mole e o bode monta aos 12?</w:t>
+        <w:t xml:space="preserve">No Hill Country, um único bode reprodutor cobre</w:t>
+      </w:r>
+      <w:r>
+        <w:t xml:space="preserve"> </w:t>
+      </w:r>
+      <w:r>
+        <w:rPr>
+          <w:bCs/>
+          <w:b/>
+        </w:rPr>
+        <w:t xml:space="preserve">100 fêmeas em 45 dias</w:t>
+      </w:r>
+      <w:r>
+        <w:t xml:space="preserve">. Cem. Daí nascem 180 cabritos, e o criador conta isso em dinheiro:</w:t>
+      </w:r>
+      <w:r>
+        <w:t xml:space="preserve"> </w:t>
+      </w:r>
+      <w:r>
+        <w:t xml:space="preserve">“</w:t>
+      </w:r>
+      <w:r>
+        <w:t xml:space="preserve">$54 mil por ano, o pau de um bode</w:t>
+      </w:r>
+      <w:r>
+        <w:t xml:space="preserve">”</w:t>
+      </w:r>
+      <w:r>
+        <w:t xml:space="preserve">. Ele faz isso aos 12 anos (um homem de 80), e as fêmeas entram no cio só de sentir o cheiro dele quando entra no curral (efeito do macho, veterinária). Ele come o mesmo capim com o mesmo veneno que está no seu bife, e não cimenta. Na fazenda de bode não existe Viagra: bode que amolece vai pro leilão de segunda e vira churrasco de domingo. O criador tem um balde escrito SODA ao lado do cocho (verdade checável: tampão de rúmen) e um pote de mel escuro na prateleira do curral. Na época da monta, uma colher daquele mel, uma pitada daquele pó, água morna, no cocho. Pergunta paradoxal:</w:t>
+      </w:r>
+      <w:r>
+        <w:t xml:space="preserve"> </w:t>
+      </w:r>
+      <w:r>
+        <w:t xml:space="preserve">“</w:t>
+      </w:r>
+      <w:r>
+        <w:t xml:space="preserve">Se a erva do bode está em todo Walmart por $14, por que você não aguenta uma mulher e o bode cobre cem aos 12?</w:t>
       </w:r>
       <w:r>
         <w:t xml:space="preserve">”</w:t>
@@ -10279,7 +10307,52 @@
         <w:t xml:space="preserve"> </w:t>
       </w:r>
       <w:r>
-        <w:t xml:space="preserve">Entra pela exceção improvável em 20 s; no segundo minuto desmonta a prateleira e o cavalo:</w:t>
+        <w:t xml:space="preserve">Entra pela exceção improvável em 20 s (</w:t>
+      </w:r>
+      <w:r>
+        <w:rPr>
+          <w:rStyle w:val="VerbatimChar"/>
+        </w:rPr>
+        <w:t xml:space="preserve">[OP1]</w:t>
+      </w:r>
+      <w:r>
+        <w:t xml:space="preserve"> </w:t>
+      </w:r>
+      <w:r>
+        <w:t xml:space="preserve">“</w:t>
+      </w:r>
+      <w:r>
+        <w:t xml:space="preserve">um bode, cem fêmeas, 45 dias, aos 12 anos</w:t>
+      </w:r>
+      <w:r>
+        <w:t xml:space="preserve">”</w:t>
+      </w:r>
+      <w:r>
+        <w:t xml:space="preserve">;</w:t>
+      </w:r>
+      <w:r>
+        <w:t xml:space="preserve"> </w:t>
+      </w:r>
+      <w:r>
+        <w:rPr>
+          <w:rStyle w:val="VerbatimChar"/>
+        </w:rPr>
+        <w:t xml:space="preserve">[OP2]</w:t>
+      </w:r>
+      <w:r>
+        <w:t xml:space="preserve"> </w:t>
+      </w:r>
+      <w:r>
+        <w:t xml:space="preserve">“</w:t>
+      </w:r>
+      <w:r>
+        <w:t xml:space="preserve">40 libras de tecido novo em 90 dias, aos 12 anos</w:t>
+      </w:r>
+      <w:r>
+        <w:t xml:space="preserve">”</w:t>
+      </w:r>
+      <w:r>
+        <w:t xml:space="preserve">); no segundo minuto desmonta a prateleira e o cavalo:</w:t>
       </w:r>
       <w:r>
         <w:t xml:space="preserve"> </w:t>

</xml_diff>

<commit_message>
Decisão: Opção 1 (Goat Honey Trick). Brief de oferta v2 final com provas do MUP do cimento reforçadas; v1 arquivada
Co-Authored-By: Claude Fable 5.1 <noreply@anthropic.com>
Claude-Session: https://claude.ai/code/session_017HYp1xhSzB6Ui5hyJvLbGE
</commit_message>
<xml_diff>
--- a/05_Brief_de_Oferta_VSL2_Duas_Opcoes.docx
+++ b/05_Brief_de_Oferta_VSL2_Duas_Opcoes.docx
@@ -457,7 +457,7 @@
           <w:rFonts w:ascii="Lexend" w:cs="Lexend" w:eastAsia="Lexend" w:hAnsi="Lexend"/>
           <w:rtl w:val="0"/>
         </w:rPr>
-        <w:t xml:space="preserve">Transformação esperada (marcos, as duas opções):</w:t>
+        <w:t xml:space="preserve">Transformação esperada (marcos, as duas):</w:t>
       </w:r>
     </w:p>
     <w:p>
@@ -637,7 +637,7 @@
           <w:rFonts w:ascii="Lexend" w:cs="Lexend" w:eastAsia="Lexend" w:hAnsi="Lexend"/>
           <w:rtl w:val="0"/>
         </w:rPr>
-        <w:t xml:space="preserve">Público-alvo (detalhado, as duas opções):</w:t>
+        <w:t xml:space="preserve">Público-alvo (detalhado, as duas):</w:t>
       </w:r>
     </w:p>
     <w:p>
@@ -982,7 +982,7 @@
           <w:iCs w:val="1"/>
           <w:rtl w:val="0"/>
         </w:rPr>
-        <w:t xml:space="preserve">(Cada uma deve ser clara, única e com potencial de escalabilidade. Tudo sem marca é igual nas duas opções; [OP1] e [OP2] marcam o que difere.)</w:t>
+        <w:t xml:space="preserve">(Cada uma deve ser clara, única e com potencial de escalabilidade)</w:t>
       </w:r>
     </w:p>
     <w:p>
@@ -1315,7 +1315,7 @@
           <w:rFonts w:ascii="Lexend" w:cs="Lexend" w:eastAsia="Lexend" w:hAnsi="Lexend"/>
           <w:rtl w:val="0"/>
         </w:rPr>
-        <w:t xml:space="preserve"> Animal + veículo: a exceção improvável em 20 s (bode e o cocho / alce e a galhada) — Opção 1 e 2</w:t>
+        <w:t xml:space="preserve"> Animal + veículo: a exceção improvável em 20 s (bode e o cocho / alce e a galhada) — 1 e 2</w:t>
       </w:r>
     </w:p>
     <w:p>
@@ -1344,7 +1344,7 @@
           <w:rFonts w:ascii="Lexend" w:cs="Lexend" w:eastAsia="Lexend" w:hAnsi="Lexend"/>
           <w:rtl w:val="0"/>
         </w:rPr>
-        <w:t xml:space="preserve"> Mel + Vick: "o truque que está rodando pra memória também acorda outra coisa" (Vick só na pele; marca dita uma vez, depois "a pomada de mentol") — Opção 1</w:t>
+        <w:t xml:space="preserve"> Mel + Vick: "o truque que está rodando pra memória também acorda outra coisa" (Vick só na pele; marca dita uma vez, depois "a pomada de mentol") — 1</w:t>
       </w:r>
     </w:p>
     <w:p>
@@ -1373,7 +1373,7 @@
           <w:rFonts w:ascii="Lexend" w:cs="Lexend" w:eastAsia="Lexend" w:hAnsi="Lexend"/>
           <w:rtl w:val="0"/>
         </w:rPr>
-        <w:t xml:space="preserve"> A mulher: Noor em 1ª pessoa / pré-lead feminina de criadora (padrão JellyRock e cluster mel) — Opção 1 e 2</w:t>
+        <w:t xml:space="preserve"> A mulher: Noor em 1ª pessoa / pré-lead feminina de criadora (padrão JellyRock e cluster mel) — 1 e 2</w:t>
       </w:r>
     </w:p>
     <w:p>
@@ -1402,7 +1402,7 @@
           <w:rFonts w:ascii="Lexend" w:cs="Lexend" w:eastAsia="Lexend" w:hAnsi="Lexend"/>
           <w:rtl w:val="0"/>
         </w:rPr>
-        <w:t xml:space="preserve"> Gupta confessa (Ideia 3) — Opção 1 e 2</w:t>
+        <w:t xml:space="preserve"> Gupta confessa (Ideia 3) — 1 e 2</w:t>
       </w:r>
     </w:p>
     <w:p>

</xml_diff>